<commit_message>
refactor: update CV documents, remove redundant PDF, and enhance resume website with interactive contact links and updated professional content
</commit_message>
<xml_diff>
--- a/doc/Boby_Kumar_CV_Simple.docx
+++ b/doc/Boby_Kumar_CV_Simple.docx
@@ -4,41 +4,39 @@
   <w:body>
     <w:p>
       <w:pPr>
-        <w:spacing w:after="20" w:before="0"/>
+        <w:spacing w:before="0" w:after="20"/>
         <w:jc w:val="center"/>
       </w:pPr>
       <w:r>
         <w:rPr>
-          <w:rFonts w:ascii="Calibri" w:hAnsi="Calibri"/>
           <w:b/>
           <w:color w:val="1A1A1A"/>
-          <w:sz w:val="48"/>
+          <w:sz w:val="44"/>
         </w:rPr>
         <w:t>Boby Kumar</w:t>
       </w:r>
     </w:p>
     <w:p>
       <w:pPr>
-        <w:spacing w:after="80" w:before="0"/>
+        <w:spacing w:before="0" w:after="50"/>
         <w:jc w:val="center"/>
       </w:pPr>
       <w:r>
         <w:rPr>
-          <w:rFonts w:ascii="Calibri" w:hAnsi="Calibri"/>
+          <w:b w:val="0"/>
           <w:color w:val="555555"/>
-          <w:sz w:val="20"/>
+          <w:sz w:val="19"/>
         </w:rPr>
         <w:t>Full-Stack / Backend Developer</w:t>
       </w:r>
     </w:p>
     <w:p>
       <w:pPr>
-        <w:spacing w:after="60" w:before="0"/>
+        <w:spacing w:before="0" w:after="70"/>
         <w:jc w:val="center"/>
       </w:pPr>
       <w:r>
         <w:rPr>
-          <w:rFonts w:ascii="Calibri" w:hAnsi="Calibri"/>
           <w:color w:val="555555"/>
           <w:sz w:val="17"/>
         </w:rPr>
@@ -46,7 +44,6 @@
       </w:r>
       <w:r>
         <w:rPr>
-          <w:rFonts w:ascii="Calibri" w:hAnsi="Calibri"/>
           <w:color w:val="888888"/>
           <w:sz w:val="16"/>
         </w:rPr>
@@ -54,7 +51,6 @@
       </w:r>
       <w:r>
         <w:rPr>
-          <w:rFonts w:ascii="Calibri" w:hAnsi="Calibri"/>
           <w:color w:val="555555"/>
           <w:sz w:val="17"/>
         </w:rPr>
@@ -62,7 +58,6 @@
       </w:r>
       <w:r>
         <w:rPr>
-          <w:rFonts w:ascii="Calibri" w:hAnsi="Calibri"/>
           <w:color w:val="888888"/>
           <w:sz w:val="16"/>
         </w:rPr>
@@ -70,7 +65,6 @@
       </w:r>
       <w:r>
         <w:rPr>
-          <w:rFonts w:ascii="Calibri" w:hAnsi="Calibri"/>
           <w:color w:val="555555"/>
           <w:sz w:val="17"/>
         </w:rPr>
@@ -78,7 +72,6 @@
       </w:r>
       <w:r>
         <w:rPr>
-          <w:rFonts w:ascii="Calibri" w:hAnsi="Calibri"/>
           <w:color w:val="888888"/>
           <w:sz w:val="16"/>
         </w:rPr>
@@ -86,7 +79,6 @@
       </w:r>
       <w:r>
         <w:rPr>
-          <w:rFonts w:ascii="Calibri" w:hAnsi="Calibri"/>
           <w:color w:val="555555"/>
           <w:sz w:val="17"/>
         </w:rPr>
@@ -95,185 +87,160 @@
     </w:p>
     <w:p>
       <w:pPr>
-        <w:spacing w:before="20" w:after="0"/>
-        <w:pBdr>
-          <w:bottom w:val="single" w:sz="4" w:space="2" w:color="999999"/>
-        </w:pBdr>
-      </w:pPr>
-    </w:p>
-    <w:p>
-      <w:pPr>
-        <w:spacing w:before="100" w:after="80"/>
+        <w:spacing w:before="130" w:after="40"/>
         <w:pBdr>
           <w:bottom w:val="single" w:sz="4" w:space="2" w:color="999999"/>
         </w:pBdr>
       </w:pPr>
       <w:r>
         <w:rPr>
-          <w:rFonts w:ascii="Calibri" w:hAnsi="Calibri"/>
           <w:b/>
           <w:color w:val="2C2C2C"/>
           <w:sz w:val="18"/>
-          <w:spacing w:val="40"/>
         </w:rPr>
         <w:t>PROFESSIONAL SUMMARY</w:t>
       </w:r>
     </w:p>
     <w:p>
       <w:pPr>
-        <w:spacing w:after="40" w:line="288" w:lineRule="auto"/>
+        <w:spacing w:before="30" w:after="30" w:line="269" w:lineRule="auto"/>
       </w:pPr>
       <w:r>
         <w:rPr>
-          <w:rFonts w:ascii="Calibri" w:hAnsi="Calibri"/>
           <w:color w:val="555555"/>
-          <w:sz w:val="18"/>
+          <w:sz w:val="17"/>
         </w:rPr>
-        <w:t>Backend-focused Full-Stack Developer with practical experience building web applications and APIs using JavaScript, Node.js, Express, React, and modern backend technologies. Strong understanding of asynchronous programming, Event Loop, REST APIs, authentication, database design, testing, and production-oriented development.</w:t>
+        <w:t>Backend-focused Full-Stack Developer with almost 5 years practical experience building web applications and APIs using JavaScript, Node.js, Express, React, and modern backend technologies. Strong understanding of asynchronous programming, Event Loop, REST APIs, authentication, database design, testing, and production-oriented development.</w:t>
       </w:r>
     </w:p>
     <w:p>
       <w:pPr>
-        <w:spacing w:before="180" w:after="80"/>
+        <w:spacing w:before="130" w:after="40"/>
         <w:pBdr>
           <w:bottom w:val="single" w:sz="4" w:space="2" w:color="999999"/>
         </w:pBdr>
       </w:pPr>
       <w:r>
         <w:rPr>
-          <w:rFonts w:ascii="Calibri" w:hAnsi="Calibri"/>
           <w:b/>
           <w:color w:val="2C2C2C"/>
           <w:sz w:val="18"/>
-          <w:spacing w:val="40"/>
         </w:rPr>
         <w:t>TECHNICAL SKILLS</w:t>
       </w:r>
     </w:p>
     <w:p>
       <w:pPr>
-        <w:spacing w:before="20" w:after="20" w:line="276" w:lineRule="auto"/>
+        <w:spacing w:before="10" w:after="10" w:line="264" w:lineRule="auto"/>
       </w:pPr>
       <w:r>
         <w:rPr>
-          <w:rFonts w:ascii="Calibri" w:hAnsi="Calibri"/>
           <w:b/>
           <w:color w:val="333333"/>
-          <w:sz w:val="18"/>
+          <w:sz w:val="17"/>
         </w:rPr>
         <w:t xml:space="preserve">Languages:  </w:t>
       </w:r>
       <w:r>
         <w:rPr>
-          <w:rFonts w:ascii="Calibri" w:hAnsi="Calibri"/>
           <w:color w:val="555555"/>
-          <w:sz w:val="18"/>
+          <w:sz w:val="17"/>
         </w:rPr>
         <w:t>JavaScript</w:t>
       </w:r>
     </w:p>
     <w:p>
       <w:pPr>
-        <w:spacing w:before="20" w:after="20" w:line="276" w:lineRule="auto"/>
+        <w:spacing w:before="10" w:after="10" w:line="264" w:lineRule="auto"/>
       </w:pPr>
       <w:r>
         <w:rPr>
-          <w:rFonts w:ascii="Calibri" w:hAnsi="Calibri"/>
           <w:b/>
           <w:color w:val="333333"/>
-          <w:sz w:val="18"/>
+          <w:sz w:val="17"/>
         </w:rPr>
         <w:t xml:space="preserve">Frontend:  </w:t>
       </w:r>
       <w:r>
         <w:rPr>
-          <w:rFonts w:ascii="Calibri" w:hAnsi="Calibri"/>
           <w:color w:val="555555"/>
-          <w:sz w:val="18"/>
+          <w:sz w:val="17"/>
         </w:rPr>
         <w:t>React</w:t>
       </w:r>
     </w:p>
     <w:p>
       <w:pPr>
-        <w:spacing w:before="20" w:after="20" w:line="276" w:lineRule="auto"/>
+        <w:spacing w:before="10" w:after="10" w:line="264" w:lineRule="auto"/>
       </w:pPr>
       <w:r>
         <w:rPr>
-          <w:rFonts w:ascii="Calibri" w:hAnsi="Calibri"/>
           <w:b/>
           <w:color w:val="333333"/>
-          <w:sz w:val="18"/>
+          <w:sz w:val="17"/>
         </w:rPr>
         <w:t xml:space="preserve">Backend:  </w:t>
       </w:r>
       <w:r>
         <w:rPr>
-          <w:rFonts w:ascii="Calibri" w:hAnsi="Calibri"/>
           <w:color w:val="555555"/>
-          <w:sz w:val="18"/>
+          <w:sz w:val="17"/>
         </w:rPr>
         <w:t>Node.js, Express.js, NestJS, REST APIs, GraphQL, WebSockets</w:t>
       </w:r>
     </w:p>
     <w:p>
       <w:pPr>
-        <w:spacing w:before="20" w:after="20" w:line="276" w:lineRule="auto"/>
+        <w:spacing w:before="10" w:after="10" w:line="264" w:lineRule="auto"/>
       </w:pPr>
       <w:r>
         <w:rPr>
-          <w:rFonts w:ascii="Calibri" w:hAnsi="Calibri"/>
           <w:b/>
           <w:color w:val="333333"/>
-          <w:sz w:val="18"/>
+          <w:sz w:val="17"/>
         </w:rPr>
         <w:t xml:space="preserve">Databases:  </w:t>
       </w:r>
       <w:r>
         <w:rPr>
-          <w:rFonts w:ascii="Calibri" w:hAnsi="Calibri"/>
           <w:color w:val="555555"/>
-          <w:sz w:val="18"/>
+          <w:sz w:val="17"/>
         </w:rPr>
         <w:t>MongoDB, Redis</w:t>
       </w:r>
     </w:p>
     <w:p>
       <w:pPr>
-        <w:spacing w:before="20" w:after="20" w:line="276" w:lineRule="auto"/>
+        <w:spacing w:before="10" w:after="10" w:line="264" w:lineRule="auto"/>
       </w:pPr>
       <w:r>
         <w:rPr>
-          <w:rFonts w:ascii="Calibri" w:hAnsi="Calibri"/>
           <w:b/>
           <w:color w:val="333333"/>
-          <w:sz w:val="18"/>
+          <w:sz w:val="17"/>
         </w:rPr>
         <w:t xml:space="preserve">DevOps / Cloud:  </w:t>
       </w:r>
       <w:r>
         <w:rPr>
-          <w:rFonts w:ascii="Calibri" w:hAnsi="Calibri"/>
           <w:color w:val="555555"/>
-          <w:sz w:val="18"/>
+          <w:sz w:val="17"/>
         </w:rPr>
         <w:t>CI/CD, Docker, AWS, Hostinger, Vercel, Firebase</w:t>
       </w:r>
     </w:p>
     <w:p>
       <w:pPr>
-        <w:spacing w:before="180" w:after="80"/>
+        <w:spacing w:before="130" w:after="40"/>
         <w:pBdr>
           <w:bottom w:val="single" w:sz="4" w:space="2" w:color="999999"/>
         </w:pBdr>
       </w:pPr>
       <w:r>
         <w:rPr>
-          <w:rFonts w:ascii="Calibri" w:hAnsi="Calibri"/>
           <w:b/>
           <w:color w:val="2C2C2C"/>
           <w:sz w:val="18"/>
-          <w:spacing w:val="40"/>
         </w:rPr>
         <w:t>PROFESSIONAL EXPERIENCE</w:t>
       </w:r>
@@ -283,14 +250,13 @@
         <w:tabs>
           <w:tab w:pos="10080" w:val="right"/>
         </w:tabs>
-        <w:spacing w:before="40" w:after="0"/>
+        <w:spacing w:before="30" w:after="0"/>
       </w:pPr>
       <w:r>
         <w:rPr>
-          <w:rFonts w:ascii="Calibri" w:hAnsi="Calibri"/>
           <w:b/>
           <w:color w:val="333333"/>
-          <w:sz w:val="19"/>
+          <w:sz w:val="18"/>
         </w:rPr>
         <w:t>Freelance / Subcontract Software Developer</w:t>
       </w:r>
@@ -299,23 +265,21 @@
       </w:r>
       <w:r>
         <w:rPr>
-          <w:rFonts w:ascii="Calibri" w:hAnsi="Calibri"/>
+          <w:b w:val="0"/>
           <w:color w:val="888888"/>
-          <w:sz w:val="18"/>
+          <w:sz w:val="17"/>
         </w:rPr>
         <w:t>2021 – Present</w:t>
       </w:r>
     </w:p>
     <w:p>
       <w:pPr>
-        <w:spacing w:before="0" w:after="40"/>
+        <w:spacing w:before="0" w:after="30"/>
       </w:pPr>
       <w:r>
         <w:rPr>
-          <w:rFonts w:ascii="Calibri" w:hAnsi="Calibri"/>
-          <w:i/>
           <w:color w:val="888888"/>
-          <w:sz w:val="17"/>
+          <w:sz w:val="16"/>
         </w:rPr>
         <w:t>India</w:t>
       </w:r>
@@ -323,14 +287,13 @@
     <w:p>
       <w:pPr>
         <w:pStyle w:val="ListBullet"/>
-        <w:spacing w:after="20" w:before="0" w:line="276" w:lineRule="auto"/>
-        <w:ind w:left="360"/>
+        <w:spacing w:before="0" w:after="10" w:line="264" w:lineRule="auto"/>
+        <w:ind w:left="280"/>
       </w:pPr>
       <w:r>
         <w:rPr>
-          <w:rFonts w:ascii="Calibri" w:hAnsi="Calibri"/>
           <w:color w:val="555555"/>
-          <w:sz w:val="18"/>
+          <w:sz w:val="17"/>
         </w:rPr>
         <w:t>Developed and maintained web applications and backend services, translating business requirements into reliable, maintainable features.</w:t>
       </w:r>
@@ -338,14 +301,13 @@
     <w:p>
       <w:pPr>
         <w:pStyle w:val="ListBullet"/>
-        <w:spacing w:after="20" w:before="0" w:line="276" w:lineRule="auto"/>
-        <w:ind w:left="360"/>
+        <w:spacing w:before="0" w:after="10" w:line="264" w:lineRule="auto"/>
+        <w:ind w:left="280"/>
       </w:pPr>
       <w:r>
         <w:rPr>
-          <w:rFonts w:ascii="Calibri" w:hAnsi="Calibri"/>
           <w:color w:val="555555"/>
-          <w:sz w:val="18"/>
+          <w:sz w:val="17"/>
         </w:rPr>
         <w:t>Built REST APIs with Node.js and Express.js and integrated frontend applications built with React and Next.js.</w:t>
       </w:r>
@@ -353,68 +315,66 @@
     <w:p>
       <w:pPr>
         <w:pStyle w:val="ListBullet"/>
-        <w:spacing w:after="20" w:before="0" w:line="276" w:lineRule="auto"/>
-        <w:ind w:left="360"/>
+        <w:spacing w:before="0" w:after="10" w:line="264" w:lineRule="auto"/>
+        <w:ind w:left="280"/>
       </w:pPr>
       <w:r>
         <w:rPr>
-          <w:rFonts w:ascii="Calibri" w:hAnsi="Calibri"/>
           <w:color w:val="555555"/>
-          <w:sz w:val="18"/>
+          <w:sz w:val="17"/>
         </w:rPr>
         <w:t>Worked with MongoDB and database concepts including CRUD operations, aggregation, indexes, and query optimization.</w:t>
       </w:r>
     </w:p>
     <w:p>
       <w:pPr>
-        <w:spacing w:before="180" w:after="80"/>
+        <w:spacing w:before="130" w:after="40"/>
         <w:pBdr>
           <w:bottom w:val="single" w:sz="4" w:space="2" w:color="999999"/>
         </w:pBdr>
       </w:pPr>
       <w:r>
         <w:rPr>
-          <w:rFonts w:ascii="Calibri" w:hAnsi="Calibri"/>
           <w:b/>
           <w:color w:val="2C2C2C"/>
           <w:sz w:val="18"/>
-          <w:spacing w:val="40"/>
         </w:rPr>
         <w:t>PROJECTS</w:t>
       </w:r>
     </w:p>
     <w:p>
       <w:pPr>
-        <w:spacing w:before="40" w:after="20"/>
+        <w:spacing w:before="30" w:after="0"/>
       </w:pPr>
       <w:r>
         <w:rPr>
-          <w:rFonts w:ascii="Calibri" w:hAnsi="Calibri"/>
           <w:b/>
           <w:color w:val="333333"/>
-          <w:sz w:val="19"/>
-        </w:rPr>
-        <w:t>Full-Stack Web Application</w:t>
-      </w:r>
-      <w:r>
-        <w:rPr>
-          <w:rFonts w:ascii="Calibri" w:hAnsi="Calibri"/>
-          <w:color w:val="555555"/>
           <w:sz w:val="18"/>
         </w:rPr>
-        <w:t xml:space="preserve">  —  Online Marketplace Platform (Backend + Admin)</w:t>
+        <w:t>Full-Stack Web Application  -  Subcontract Project</w:t>
       </w:r>
     </w:p>
     <w:p>
       <w:pPr>
-        <w:spacing w:before="0" w:after="20"/>
+        <w:spacing w:before="0" w:after="0"/>
       </w:pPr>
       <w:r>
         <w:rPr>
-          <w:rFonts w:ascii="Calibri" w:hAnsi="Calibri"/>
-          <w:i/>
+          <w:color w:val="555555"/>
+          <w:sz w:val="17"/>
+        </w:rPr>
+        <w:t>Online Marketplace Platform (Backend + Admin)</w:t>
+      </w:r>
+    </w:p>
+    <w:p>
+      <w:pPr>
+        <w:spacing w:before="0" w:after="10"/>
+      </w:pPr>
+      <w:r>
+        <w:rPr>
           <w:color w:val="888888"/>
-          <w:sz w:val="17"/>
+          <w:sz w:val="16"/>
         </w:rPr>
         <w:t>Node.js, Express, GraphQL, MongoDB, React, Docker</w:t>
       </w:r>
@@ -422,90 +382,121 @@
     <w:p>
       <w:pPr>
         <w:pStyle w:val="ListBullet"/>
-        <w:spacing w:after="20" w:before="0" w:line="276" w:lineRule="auto"/>
-        <w:ind w:left="360"/>
+        <w:spacing w:before="0" w:after="10" w:line="264" w:lineRule="auto"/>
+        <w:ind w:left="280"/>
       </w:pPr>
       <w:r>
         <w:rPr>
-          <w:rFonts w:ascii="Calibri" w:hAnsi="Calibri"/>
           <w:color w:val="555555"/>
-          <w:sz w:val="18"/>
+          <w:sz w:val="17"/>
         </w:rPr>
         <w:t>Developed a modular GraphQL API (users, listings, chat, moderation) on Express and MongoDB, with JWT auth and resolver-level authorization.</w:t>
       </w:r>
     </w:p>
     <w:p>
       <w:pPr>
-        <w:spacing w:before="120" w:after="0"/>
+        <w:spacing w:before="50" w:after="0"/>
       </w:pPr>
       <w:r>
         <w:rPr>
-          <w:rFonts w:ascii="Calibri" w:hAnsi="Calibri"/>
           <w:b/>
           <w:color w:val="333333"/>
-          <w:sz w:val="19"/>
+          <w:sz w:val="18"/>
         </w:rPr>
-        <w:t>Real-Time Application</w:t>
+        <w:t>Real-Time SaaS Application -   Subcontract Project</w:t>
       </w:r>
     </w:p>
     <w:p>
       <w:pPr>
-        <w:spacing w:before="0" w:after="20"/>
+        <w:spacing w:before="0" w:after="10"/>
       </w:pPr>
       <w:r>
         <w:rPr>
-          <w:rFonts w:ascii="Calibri" w:hAnsi="Calibri"/>
-          <w:i/>
           <w:color w:val="888888"/>
-          <w:sz w:val="17"/>
+          <w:sz w:val="16"/>
         </w:rPr>
-        <w:t>Node.js, WebSockets / Socket.IO, React</w:t>
+        <w:t>Node.js, WebSockets / Socket.IO, React, MongoDB</w:t>
       </w:r>
     </w:p>
     <w:p>
       <w:pPr>
         <w:pStyle w:val="ListBullet"/>
-        <w:spacing w:after="20" w:before="0" w:line="276" w:lineRule="auto"/>
-        <w:ind w:left="360"/>
+        <w:spacing w:before="0" w:after="10" w:line="264" w:lineRule="auto"/>
+        <w:ind w:left="280"/>
       </w:pPr>
       <w:r>
         <w:rPr>
-          <w:rFonts w:ascii="Calibri" w:hAnsi="Calibri"/>
           <w:color w:val="555555"/>
-          <w:sz w:val="18"/>
+          <w:sz w:val="17"/>
         </w:rPr>
-        <w:t>Designed Socket.IO rooms mapped 1:1 to database chat IDs; users join all rooms on connect and leave only their own socket on disconnect.</w:t>
+        <w:t>Apps/web just grab an API key and boom , they can implement and use 1:1 chat</w:t>
       </w:r>
     </w:p>
     <w:p>
       <w:pPr>
         <w:pStyle w:val="ListBullet"/>
-        <w:spacing w:after="20" w:before="0" w:line="276" w:lineRule="auto"/>
-        <w:ind w:left="360"/>
+        <w:spacing w:before="0" w:after="10" w:line="264" w:lineRule="auto"/>
+        <w:ind w:left="280"/>
       </w:pPr>
       <w:r>
         <w:rPr>
-          <w:rFonts w:ascii="Calibri" w:hAnsi="Calibri"/>
           <w:color w:val="555555"/>
-          <w:sz w:val="18"/>
+          <w:sz w:val="17"/>
         </w:rPr>
-        <w:t>Delivered real-time messages, presence, and delivery status with NestJS/TypeScript; Redis adapter for multi-instance fan-out and FCM when users are offline.</w:t>
+        <w:t>Designed Socket.IO rooms mapped 1:1 to database chat IDs; users join all rooms , leave room , delivered real-time messages, presence, and delivery status with Socke.io; Redis adapter for multi-instance fan-out and FCM when users are offline</w:t>
       </w:r>
     </w:p>
     <w:p>
       <w:pPr>
-        <w:spacing w:before="180" w:after="80"/>
+        <w:spacing w:before="50" w:after="0"/>
+      </w:pPr>
+      <w:r>
+        <w:rPr>
+          <w:b/>
+          <w:color w:val="333333"/>
+          <w:sz w:val="18"/>
+        </w:rPr>
+        <w:t>Full Stack Parking Application -   Subcontract Project</w:t>
+      </w:r>
+    </w:p>
+    <w:p>
+      <w:pPr>
+        <w:spacing w:before="0" w:after="10"/>
+      </w:pPr>
+      <w:r>
+        <w:rPr>
+          <w:color w:val="888888"/>
+          <w:sz w:val="16"/>
+        </w:rPr>
+        <w:t>Node.js, Nest.js / android native app(composable)</w:t>
+      </w:r>
+    </w:p>
+    <w:p>
+      <w:pPr>
+        <w:pStyle w:val="ListBullet"/>
+        <w:spacing w:before="0" w:after="10" w:line="264" w:lineRule="auto"/>
+        <w:ind w:left="280"/>
+      </w:pPr>
+      <w:r>
+        <w:rPr>
+          <w:color w:val="555555"/>
+          <w:sz w:val="17"/>
+        </w:rPr>
+        <w:t>parking management for. Parking operators use it to run their lot of garages and valet stands. There's a NestJS backend with MongoD, a Next.js web app that has operator portals, and a Kotlin Compose Android app that valet attendants use on handheld devices.</w:t>
+      </w:r>
+    </w:p>
+    <w:p>
+      <w:pPr>
+        <w:spacing w:before="130" w:after="40"/>
         <w:pBdr>
           <w:bottom w:val="single" w:sz="4" w:space="2" w:color="999999"/>
         </w:pBdr>
       </w:pPr>
       <w:r>
         <w:rPr>
-          <w:rFonts w:ascii="Calibri" w:hAnsi="Calibri"/>
           <w:b/>
           <w:color w:val="2C2C2C"/>
           <w:sz w:val="18"/>
-          <w:spacing w:val="40"/>
         </w:rPr>
         <w:t>EDUCATION</w:t>
       </w:r>
@@ -515,163 +506,31 @@
         <w:tabs>
           <w:tab w:pos="10080" w:val="right"/>
         </w:tabs>
-        <w:spacing w:before="40" w:after="0"/>
+        <w:spacing w:before="30" w:after="0"/>
       </w:pPr>
       <w:r>
         <w:rPr>
-          <w:rFonts w:ascii="Calibri" w:hAnsi="Calibri"/>
           <w:b/>
           <w:color w:val="333333"/>
-          <w:sz w:val="19"/>
+          <w:sz w:val="18"/>
         </w:rPr>
-        <w:t>Bachelor of Computer Applications (BCA)</w:t>
+        <w:t>BCA-Jamia Hamdard University</w:t>
       </w:r>
       <w:r>
         <w:tab/>
       </w:r>
       <w:r>
         <w:rPr>
-          <w:rFonts w:ascii="Calibri" w:hAnsi="Calibri"/>
+          <w:b w:val="0"/>
           <w:color w:val="888888"/>
-          <w:sz w:val="18"/>
+          <w:sz w:val="17"/>
         </w:rPr>
         <w:t>2014 – 2017</w:t>
       </w:r>
     </w:p>
-    <w:p>
-      <w:pPr>
-        <w:spacing w:before="0" w:after="40"/>
-      </w:pPr>
-      <w:r>
-        <w:rPr>
-          <w:rFonts w:ascii="Calibri" w:hAnsi="Calibri"/>
-          <w:i/>
-          <w:color w:val="888888"/>
-          <w:sz w:val="17"/>
-        </w:rPr>
-        <w:t>Jamia Humdard University, India</w:t>
-      </w:r>
-    </w:p>
-    <w:p>
-      <w:pPr>
-        <w:spacing w:before="180" w:after="80"/>
-        <w:pBdr>
-          <w:bottom w:val="single" w:sz="4" w:space="2" w:color="999999"/>
-        </w:pBdr>
-      </w:pPr>
-      <w:r>
-        <w:rPr>
-          <w:rFonts w:ascii="Calibri" w:hAnsi="Calibri"/>
-          <w:b/>
-          <w:color w:val="2C2C2C"/>
-          <w:sz w:val="18"/>
-          <w:spacing w:val="40"/>
-        </w:rPr>
-        <w:t>CORE STRENGTHS</w:t>
-      </w:r>
-    </w:p>
-    <w:p>
-      <w:pPr>
-        <w:spacing w:before="40" w:after="40"/>
-      </w:pPr>
-      <w:r>
-        <w:rPr>
-          <w:rFonts w:ascii="Calibri" w:hAnsi="Calibri"/>
-          <w:b/>
-          <w:color w:val="333333"/>
-          <w:sz w:val="18"/>
-        </w:rPr>
-        <w:t>Backend API Development</w:t>
-      </w:r>
-      <w:r>
-        <w:rPr>
-          <w:rFonts w:ascii="Calibri" w:hAnsi="Calibri"/>
-          <w:color w:val="888888"/>
-          <w:sz w:val="16"/>
-        </w:rPr>
-        <w:t xml:space="preserve">    ·    </w:t>
-      </w:r>
-      <w:r>
-        <w:rPr>
-          <w:rFonts w:ascii="Calibri" w:hAnsi="Calibri"/>
-          <w:b/>
-          <w:color w:val="333333"/>
-          <w:sz w:val="18"/>
-        </w:rPr>
-        <w:t>Problem Solving</w:t>
-      </w:r>
-      <w:r>
-        <w:rPr>
-          <w:rFonts w:ascii="Calibri" w:hAnsi="Calibri"/>
-          <w:color w:val="888888"/>
-          <w:sz w:val="16"/>
-        </w:rPr>
-        <w:t xml:space="preserve">    ·    </w:t>
-      </w:r>
-      <w:r>
-        <w:rPr>
-          <w:rFonts w:ascii="Calibri" w:hAnsi="Calibri"/>
-          <w:b/>
-          <w:color w:val="333333"/>
-          <w:sz w:val="18"/>
-        </w:rPr>
-        <w:t>Debugging</w:t>
-      </w:r>
-      <w:r>
-        <w:rPr>
-          <w:rFonts w:ascii="Calibri" w:hAnsi="Calibri"/>
-          <w:color w:val="888888"/>
-          <w:sz w:val="16"/>
-        </w:rPr>
-        <w:t xml:space="preserve">    ·    </w:t>
-      </w:r>
-      <w:r>
-        <w:rPr>
-          <w:rFonts w:ascii="Calibri" w:hAnsi="Calibri"/>
-          <w:b/>
-          <w:color w:val="333333"/>
-          <w:sz w:val="18"/>
-        </w:rPr>
-        <w:t>Testing</w:t>
-      </w:r>
-      <w:r>
-        <w:rPr>
-          <w:rFonts w:ascii="Calibri" w:hAnsi="Calibri"/>
-          <w:color w:val="888888"/>
-          <w:sz w:val="16"/>
-        </w:rPr>
-        <w:t xml:space="preserve">    ·    </w:t>
-      </w:r>
-      <w:r>
-        <w:rPr>
-          <w:rFonts w:ascii="Calibri" w:hAnsi="Calibri"/>
-          <w:b/>
-          <w:color w:val="333333"/>
-          <w:sz w:val="18"/>
-        </w:rPr>
-        <w:t>Clean Code</w:t>
-      </w:r>
-      <w:r>
-        <w:rPr>
-          <w:rFonts w:ascii="Calibri" w:hAnsi="Calibri"/>
-          <w:color w:val="888888"/>
-          <w:sz w:val="16"/>
-        </w:rPr>
-        <w:t xml:space="preserve">    ·    </w:t>
-      </w:r>
-      <w:r>
-        <w:rPr>
-          <w:rFonts w:ascii="Calibri" w:hAnsi="Calibri"/>
-          <w:b/>
-          <w:color w:val="333333"/>
-          <w:sz w:val="18"/>
-        </w:rPr>
-        <w:t>Full-Stack Collaboration</w:t>
-      </w:r>
-    </w:p>
     <w:sectPr>
       <w:pgSz w:w="12240" w:h="15840"/>
-      <w:pgMar w:top="567" w:right="907" w:bottom="397" w:left="907" w:header="720" w:footer="720" w:gutter="0"/>
+      <w:pgMar w:top="720" w:right="1080" w:bottom="720" w:left="1080" w:header="720" w:footer="720" w:gutter="0"/>
       <w:cols w:space="720"/>
       <w:docGrid w:linePitch="360"/>
     </w:sectPr>
@@ -1042,13 +901,10 @@
     <w:name w:val="Normal"/>
     <w:qFormat/>
     <w:rsid w:val="00FC693F"/>
-    <w:pPr>
-      <w:spacing w:after="0" w:before="0" w:line="259" w:lineRule="auto"/>
-    </w:pPr>
     <w:rPr>
       <w:rFonts w:ascii="Calibri" w:hAnsi="Calibri"/>
-      <w:color w:val="333333"/>
-      <w:sz w:val="19"/>
+      <w:color w:val="555555"/>
+      <w:sz w:val="18"/>
     </w:rPr>
   </w:style>
   <w:style w:type="paragraph" w:styleId="Header">

</xml_diff>